<commit_message>
Remove Total Outstanding; normalize code sections to Sellbrite style
Total Outstanding button, its print function and its report-only print
CSS are gone (Monthly and Preview cover reporting). No functional
changes beyond that: JS regrouped into Sellbrite-style sections (clock,
ajax + shared helpers, grid, add, view/update, item search, reports,
print) with the shared date/escape helpers gathered in one place,
updateCurrent moved into the view section, banner comments normalized
to the /* ---- x ---- */ convention, and dev-history comment chatter
trimmed. Docs updated to match.

Co-Authored-By: Claude Fable 5 <noreply@anthropic.com>
Claude-Session: https://claude.ai/code/session_01SfunpdkVdapnCdtb2hWS9U
</commit_message>
<xml_diff>
--- a/ReqStation/docs/Requisition Material - User Guide.docx
+++ b/ReqStation/docs/Requisition Material - User Guide.docx
@@ -772,46 +772,6 @@
             </w:pPr>
             <w:r>
               <w:t xml:space="preserve">The requisition report (old rptRequest) for the selected row — click a row first. Shows unreturned items only.</w:t>
-            </w:r>
-          </w:p>
-        </w:tc>
-      </w:tr>
-      <w:tr>
-        <w:tc>
-          <w:tcPr>
-            <w:tcW w:type="dxa" w:w="2600"/>
-            <w:tcMar>
-              <w:top w:type="dxa" w:w="60"/>
-              <w:left w:type="dxa" w:w="100"/>
-              <w:bottom w:type="dxa" w:w="60"/>
-              <w:right w:type="dxa" w:w="100"/>
-            </w:tcMar>
-          </w:tcPr>
-          <w:p>
-            <w:pPr>
-              <w:spacing w:after="0"/>
-            </w:pPr>
-            <w:r>
-              <w:t xml:space="preserve">Total Outstanding</w:t>
-            </w:r>
-          </w:p>
-        </w:tc>
-        <w:tc>
-          <w:tcPr>
-            <w:tcW w:type="dxa" w:w="6760"/>
-            <w:tcMar>
-              <w:top w:type="dxa" w:w="60"/>
-              <w:left w:type="dxa" w:w="100"/>
-              <w:bottom w:type="dxa" w:w="60"/>
-              <w:right w:type="dxa" w:w="100"/>
-            </w:tcMar>
-          </w:tcPr>
-          <w:p>
-            <w:pPr>
-              <w:spacing w:after="0"/>
-            </w:pPr>
-            <w:r>
-              <w:t xml:space="preserve">Every open line, grouped by requisitioner, with cost and retail totals.</w:t>
             </w:r>
           </w:p>
         </w:tc>

</xml_diff>